<commit_message>
pipeline-cw: iteration 4 — regenerate binary docs for v0.5.0
PatentForge-Architecture.docx regenerated from the v0.5.0 ARCHITECTURE.md
via `pandoc ARCHITECTURE.md -o PatentForge-Architecture.docx`.
README-FULL.pdf regenerated from the v0.5.0 README.md via
`pandoc README.md -o README-FULL.pdf --pdf-engine=xelatex`.

Content reflects the merged-product framing (cloud-or-local) and the
new version string (0.5.0) throughout.

Run-id: 2026-05-15-0903-release-v0.5.0
</commit_message>
<xml_diff>
--- a/PatentForge-Architecture.docx
+++ b/PatentForge-Architecture.docx
@@ -23,7 +23,7 @@
         <w:t xml:space="preserve">Version</w:t>
       </w:r>
       <w:r>
-        <w:t xml:space="preserve">: 0.1.4 (PatentForge merge plan complete through Run 7)</w:t>
+        <w:t xml:space="preserve">: 0.5.0 (PatentForge merge plan complete)</w:t>
       </w:r>
       <w:r>
         <w:t xml:space="preserve"> </w:t>
@@ -49,7 +49,7 @@
         <w:t xml:space="preserve">Status</w:t>
       </w:r>
       <w:r>
-        <w:t xml:space="preserve">: Pre-release (v0.5.0 cutover in Run 8)</w:t>
+        <w:t xml:space="preserve">: Released</w:t>
       </w:r>
     </w:p>
     <w:p>

</xml_diff>